<commit_message>
Add qualitative evaluation artifacts
</commit_message>
<xml_diff>
--- a/docs/evaluation/model_evaluation_report.docx
+++ b/docs/evaluation/model_evaluation_report.docx
@@ -1,6 +1,6 @@
 
 <file path=word/document.xml><?xml version="1.0" encoding="utf-8"?>
-<w:document xmlns:w="http://schemas.openxmlformats.org/wordprocessingml/2006/main" xmlns:m="http://schemas.openxmlformats.org/officeDocument/2006/math" xmlns:r="http://schemas.openxmlformats.org/officeDocument/2006/relationships" xmlns:o="urn:schemas-microsoft-com:office:office" xmlns:v="urn:schemas-microsoft-com:vml" xmlns:w10="urn:schemas-microsoft-com:office:word" xmlns:a="http://schemas.openxmlformats.org/drawingml/2006/main" xmlns:pic="http://schemas.openxmlformats.org/drawingml/2006/picture" xmlns:wp="http://schemas.openxmlformats.org/drawingml/2006/wordprocessingDrawing">
+<w:document xmlns:ns1="urn:schemas-microsoft-com:vml" xmlns:ns2="urn:schemas-microsoft-com:office:office" xmlns:ns3="http://schemas.openxmlformats.org/drawingml/2006/wordprocessingDrawing" xmlns:ns4="http://schemas.openxmlformats.org/drawingml/2006/main" xmlns:ns5="http://schemas.openxmlformats.org/drawingml/2006/picture" xmlns:ns6="http://schemas.openxmlformats.org/officeDocument/2006/relationships" xmlns:w="http://schemas.openxmlformats.org/wordprocessingml/2006/main">
   <w:body>
     <w:bookmarkStart w:id="43" w:name="model-evaluation"/>
     <w:p>
@@ -122,7 +122,7 @@
     <w:p>
       <w:r>
         <w:pict>
-          <v:rect style="width:0;height:1.5pt" o:hralign="center" o:hrstd="t" o:hr="t"/>
+          <ns1:rect style="width:0;height:1.5pt" ns2:hralign="center" ns2:hrstd="t" ns2:hr="t"/>
         </w:pict>
       </w:r>
     </w:p>
@@ -1139,7 +1139,7 @@
     <w:p>
       <w:r>
         <w:pict>
-          <v:rect style="width:0;height:1.5pt" o:hralign="center" o:hrstd="t" o:hr="t"/>
+          <ns1:rect style="width:0;height:1.5pt" ns2:hralign="center" ns2:hrstd="t" ns2:hr="t"/>
         </w:pict>
       </w:r>
     </w:p>
@@ -1959,7 +1959,7 @@
     <w:p>
       <w:r>
         <w:pict>
-          <v:rect style="width:0;height:1.5pt" o:hralign="center" o:hrstd="t" o:hr="t"/>
+          <ns1:rect style="width:0;height:1.5pt" ns2:hralign="center" ns2:hrstd="t" ns2:hr="t"/>
         </w:pict>
       </w:r>
     </w:p>
@@ -2598,44 +2598,44 @@
       </w:pPr>
       <w:r>
         <w:drawing>
-          <wp:inline>
-            <wp:extent cx="5334000" cy="4000500"/>
-            <wp:effectExtent b="0" l="0" r="0" t="0"/>
-            <wp:docPr descr="Confusion matrix for the Rubric Classifier across four Bloom’s levels" title="" id="23" name="Picture"/>
-            <a:graphic>
-              <a:graphicData uri="http://schemas.openxmlformats.org/drawingml/2006/picture">
-                <pic:pic>
-                  <pic:nvPicPr>
-                    <pic:cNvPr descr="./visualizations/rubric_confusion_matrix.png" id="24" name="Picture"/>
-                    <pic:cNvPicPr>
-                      <a:picLocks noChangeArrowheads="1" noChangeAspect="1"/>
-                    </pic:cNvPicPr>
-                  </pic:nvPicPr>
-                  <pic:blipFill>
-                    <a:blip r:embed="rId22"/>
-                    <a:stretch>
-                      <a:fillRect/>
-                    </a:stretch>
-                  </pic:blipFill>
-                  <pic:spPr bwMode="auto">
-                    <a:xfrm>
-                      <a:off x="0" y="0"/>
-                      <a:ext cx="5334000" cy="4000500"/>
-                    </a:xfrm>
-                    <a:prstGeom prst="rect">
-                      <a:avLst/>
-                    </a:prstGeom>
-                    <a:noFill/>
-                    <a:ln w="9525">
-                      <a:noFill/>
-                      <a:headEnd/>
-                      <a:tailEnd/>
-                    </a:ln>
-                  </pic:spPr>
-                </pic:pic>
-              </a:graphicData>
-            </a:graphic>
-          </wp:inline>
+          <ns3:inline>
+            <ns3:extent cx="5334000" cy="4000500"/>
+            <ns3:effectExtent b="0" l="0" r="0" t="0"/>
+            <ns3:docPr descr="Confusion matrix for the Rubric Classifier across four Bloom’s levels" title="" id="23" name="Picture"/>
+            <ns4:graphic>
+              <ns4:graphicData uri="http://schemas.openxmlformats.org/drawingml/2006/picture">
+                <ns5:pic>
+                  <ns5:nvPicPr>
+                    <ns5:cNvPr descr="./visualizations/rubric_confusion_matrix.png" id="24" name="Picture"/>
+                    <ns5:cNvPicPr>
+                      <ns4:picLocks noChangeArrowheads="1" noChangeAspect="1"/>
+                    </ns5:cNvPicPr>
+                  </ns5:nvPicPr>
+                  <ns5:blipFill>
+                    <ns4:blip ns6:embed="rId22"/>
+                    <ns4:stretch>
+                      <ns4:fillRect/>
+                    </ns4:stretch>
+                  </ns5:blipFill>
+                  <ns5:spPr bwMode="auto">
+                    <ns4:xfrm>
+                      <ns4:off x="0" y="0"/>
+                      <ns4:ext cx="5334000" cy="4000500"/>
+                    </ns4:xfrm>
+                    <ns4:prstGeom prst="rect">
+                      <ns4:avLst/>
+                    </ns4:prstGeom>
+                    <ns4:noFill/>
+                    <ns4:ln w="9525">
+                      <ns4:noFill/>
+                      <ns4:headEnd/>
+                      <ns4:tailEnd/>
+                    </ns4:ln>
+                  </ns5:spPr>
+                </ns5:pic>
+              </ns4:graphicData>
+            </ns4:graphic>
+          </ns3:inline>
         </w:drawing>
       </w:r>
     </w:p>
@@ -2679,44 +2679,44 @@
       </w:pPr>
       <w:r>
         <w:drawing>
-          <wp:inline>
-            <wp:extent cx="5334000" cy="3333750"/>
-            <wp:effectExtent b="0" l="0" r="0" t="0"/>
-            <wp:docPr descr="F1-Score by Bloom’s level" title="" id="26" name="Picture"/>
-            <a:graphic>
-              <a:graphicData uri="http://schemas.openxmlformats.org/drawingml/2006/picture">
-                <pic:pic>
-                  <pic:nvPicPr>
-                    <pic:cNvPr descr="./visualizations/rubric_f1_scores.png" id="27" name="Picture"/>
-                    <pic:cNvPicPr>
-                      <a:picLocks noChangeArrowheads="1" noChangeAspect="1"/>
-                    </pic:cNvPicPr>
-                  </pic:nvPicPr>
-                  <pic:blipFill>
-                    <a:blip r:embed="rId25"/>
-                    <a:stretch>
-                      <a:fillRect/>
-                    </a:stretch>
-                  </pic:blipFill>
-                  <pic:spPr bwMode="auto">
-                    <a:xfrm>
-                      <a:off x="0" y="0"/>
-                      <a:ext cx="5334000" cy="3333750"/>
-                    </a:xfrm>
-                    <a:prstGeom prst="rect">
-                      <a:avLst/>
-                    </a:prstGeom>
-                    <a:noFill/>
-                    <a:ln w="9525">
-                      <a:noFill/>
-                      <a:headEnd/>
-                      <a:tailEnd/>
-                    </a:ln>
-                  </pic:spPr>
-                </pic:pic>
-              </a:graphicData>
-            </a:graphic>
-          </wp:inline>
+          <ns3:inline>
+            <ns3:extent cx="5334000" cy="3333750"/>
+            <ns3:effectExtent b="0" l="0" r="0" t="0"/>
+            <ns3:docPr descr="F1-Score by Bloom’s level" title="" id="26" name="Picture"/>
+            <ns4:graphic>
+              <ns4:graphicData uri="http://schemas.openxmlformats.org/drawingml/2006/picture">
+                <ns5:pic>
+                  <ns5:nvPicPr>
+                    <ns5:cNvPr descr="./visualizations/rubric_f1_scores.png" id="27" name="Picture"/>
+                    <ns5:cNvPicPr>
+                      <ns4:picLocks noChangeArrowheads="1" noChangeAspect="1"/>
+                    </ns5:cNvPicPr>
+                  </ns5:nvPicPr>
+                  <ns5:blipFill>
+                    <ns4:blip ns6:embed="rId25"/>
+                    <ns4:stretch>
+                      <ns4:fillRect/>
+                    </ns4:stretch>
+                  </ns5:blipFill>
+                  <ns5:spPr bwMode="auto">
+                    <ns4:xfrm>
+                      <ns4:off x="0" y="0"/>
+                      <ns4:ext cx="5334000" cy="3333750"/>
+                    </ns4:xfrm>
+                    <ns4:prstGeom prst="rect">
+                      <ns4:avLst/>
+                    </ns4:prstGeom>
+                    <ns4:noFill/>
+                    <ns4:ln w="9525">
+                      <ns4:noFill/>
+                      <ns4:headEnd/>
+                      <ns4:tailEnd/>
+                    </ns4:ln>
+                  </ns5:spPr>
+                </ns5:pic>
+              </ns4:graphicData>
+            </ns4:graphic>
+          </ns3:inline>
         </w:drawing>
       </w:r>
     </w:p>
@@ -3637,44 +3637,44 @@
       </w:pPr>
       <w:r>
         <w:drawing>
-          <wp:inline>
-            <wp:extent cx="5334000" cy="2667000"/>
-            <wp:effectExtent b="0" l="0" r="0" t="0"/>
-            <wp:docPr descr="Structural validity by topic" title="" id="31" name="Picture"/>
-            <a:graphic>
-              <a:graphicData uri="http://schemas.openxmlformats.org/drawingml/2006/picture">
-                <pic:pic>
-                  <pic:nvPicPr>
-                    <pic:cNvPr descr="./visualizations/qa_structural_validity.png" id="32" name="Picture"/>
-                    <pic:cNvPicPr>
-                      <a:picLocks noChangeArrowheads="1" noChangeAspect="1"/>
-                    </pic:cNvPicPr>
-                  </pic:nvPicPr>
-                  <pic:blipFill>
-                    <a:blip r:embed="rId30"/>
-                    <a:stretch>
-                      <a:fillRect/>
-                    </a:stretch>
-                  </pic:blipFill>
-                  <pic:spPr bwMode="auto">
-                    <a:xfrm>
-                      <a:off x="0" y="0"/>
-                      <a:ext cx="5334000" cy="2667000"/>
-                    </a:xfrm>
-                    <a:prstGeom prst="rect">
-                      <a:avLst/>
-                    </a:prstGeom>
-                    <a:noFill/>
-                    <a:ln w="9525">
-                      <a:noFill/>
-                      <a:headEnd/>
-                      <a:tailEnd/>
-                    </a:ln>
-                  </pic:spPr>
-                </pic:pic>
-              </a:graphicData>
-            </a:graphic>
-          </wp:inline>
+          <ns3:inline>
+            <ns3:extent cx="5334000" cy="2667000"/>
+            <ns3:effectExtent b="0" l="0" r="0" t="0"/>
+            <ns3:docPr descr="Structural validity by topic" title="" id="31" name="Picture"/>
+            <ns4:graphic>
+              <ns4:graphicData uri="http://schemas.openxmlformats.org/drawingml/2006/picture">
+                <ns5:pic>
+                  <ns5:nvPicPr>
+                    <ns5:cNvPr descr="./visualizations/qa_structural_validity.png" id="32" name="Picture"/>
+                    <ns5:cNvPicPr>
+                      <ns4:picLocks noChangeArrowheads="1" noChangeAspect="1"/>
+                    </ns5:cNvPicPr>
+                  </ns5:nvPicPr>
+                  <ns5:blipFill>
+                    <ns4:blip ns6:embed="rId30"/>
+                    <ns4:stretch>
+                      <ns4:fillRect/>
+                    </ns4:stretch>
+                  </ns5:blipFill>
+                  <ns5:spPr bwMode="auto">
+                    <ns4:xfrm>
+                      <ns4:off x="0" y="0"/>
+                      <ns4:ext cx="5334000" cy="2667000"/>
+                    </ns4:xfrm>
+                    <ns4:prstGeom prst="rect">
+                      <ns4:avLst/>
+                    </ns4:prstGeom>
+                    <ns4:noFill/>
+                    <ns4:ln w="9525">
+                      <ns4:noFill/>
+                      <ns4:headEnd/>
+                      <ns4:tailEnd/>
+                    </ns4:ln>
+                  </ns5:spPr>
+                </ns5:pic>
+              </ns4:graphicData>
+            </ns4:graphic>
+          </ns3:inline>
         </w:drawing>
       </w:r>
     </w:p>
@@ -3718,44 +3718,44 @@
       </w:pPr>
       <w:r>
         <w:drawing>
-          <wp:inline>
-            <wp:extent cx="5334000" cy="3810000"/>
-            <wp:effectExtent b="0" l="0" r="0" t="0"/>
-            <wp:docPr descr="LLM Judge scores" title="" id="34" name="Picture"/>
-            <a:graphic>
-              <a:graphicData uri="http://schemas.openxmlformats.org/drawingml/2006/picture">
-                <pic:pic>
-                  <pic:nvPicPr>
-                    <pic:cNvPr descr="./visualizations/qa_judge_scores.png" id="35" name="Picture"/>
-                    <pic:cNvPicPr>
-                      <a:picLocks noChangeArrowheads="1" noChangeAspect="1"/>
-                    </pic:cNvPicPr>
-                  </pic:nvPicPr>
-                  <pic:blipFill>
-                    <a:blip r:embed="rId33"/>
-                    <a:stretch>
-                      <a:fillRect/>
-                    </a:stretch>
-                  </pic:blipFill>
-                  <pic:spPr bwMode="auto">
-                    <a:xfrm>
-                      <a:off x="0" y="0"/>
-                      <a:ext cx="5334000" cy="3810000"/>
-                    </a:xfrm>
-                    <a:prstGeom prst="rect">
-                      <a:avLst/>
-                    </a:prstGeom>
-                    <a:noFill/>
-                    <a:ln w="9525">
-                      <a:noFill/>
-                      <a:headEnd/>
-                      <a:tailEnd/>
-                    </a:ln>
-                  </pic:spPr>
-                </pic:pic>
-              </a:graphicData>
-            </a:graphic>
-          </wp:inline>
+          <ns3:inline>
+            <ns3:extent cx="5334000" cy="3810000"/>
+            <ns3:effectExtent b="0" l="0" r="0" t="0"/>
+            <ns3:docPr descr="LLM Judge scores" title="" id="34" name="Picture"/>
+            <ns4:graphic>
+              <ns4:graphicData uri="http://schemas.openxmlformats.org/drawingml/2006/picture">
+                <ns5:pic>
+                  <ns5:nvPicPr>
+                    <ns5:cNvPr descr="./visualizations/qa_judge_scores.png" id="35" name="Picture"/>
+                    <ns5:cNvPicPr>
+                      <ns4:picLocks noChangeArrowheads="1" noChangeAspect="1"/>
+                    </ns5:cNvPicPr>
+                  </ns5:nvPicPr>
+                  <ns5:blipFill>
+                    <ns4:blip ns6:embed="rId33"/>
+                    <ns4:stretch>
+                      <ns4:fillRect/>
+                    </ns4:stretch>
+                  </ns5:blipFill>
+                  <ns5:spPr bwMode="auto">
+                    <ns4:xfrm>
+                      <ns4:off x="0" y="0"/>
+                      <ns4:ext cx="5334000" cy="3810000"/>
+                    </ns4:xfrm>
+                    <ns4:prstGeom prst="rect">
+                      <ns4:avLst/>
+                    </ns4:prstGeom>
+                    <ns4:noFill/>
+                    <ns4:ln w="9525">
+                      <ns4:noFill/>
+                      <ns4:headEnd/>
+                      <ns4:tailEnd/>
+                    </ns4:ln>
+                  </ns5:spPr>
+                </ns5:pic>
+              </ns4:graphicData>
+            </ns4:graphic>
+          </ns3:inline>
         </w:drawing>
       </w:r>
     </w:p>
@@ -3817,44 +3817,44 @@
       </w:pPr>
       <w:r>
         <w:drawing>
-          <wp:inline>
-            <wp:extent cx="5334000" cy="3333750"/>
-            <wp:effectExtent b="0" l="0" r="0" t="0"/>
-            <wp:docPr descr="Latency comparison" title="" id="38" name="Picture"/>
-            <a:graphic>
-              <a:graphicData uri="http://schemas.openxmlformats.org/drawingml/2006/picture">
-                <pic:pic>
-                  <pic:nvPicPr>
-                    <pic:cNvPr descr="./visualizations/latency_distribution.png" id="39" name="Picture"/>
-                    <pic:cNvPicPr>
-                      <a:picLocks noChangeArrowheads="1" noChangeAspect="1"/>
-                    </pic:cNvPicPr>
-                  </pic:nvPicPr>
-                  <pic:blipFill>
-                    <a:blip r:embed="rId37"/>
-                    <a:stretch>
-                      <a:fillRect/>
-                    </a:stretch>
-                  </pic:blipFill>
-                  <pic:spPr bwMode="auto">
-                    <a:xfrm>
-                      <a:off x="0" y="0"/>
-                      <a:ext cx="5334000" cy="3333750"/>
-                    </a:xfrm>
-                    <a:prstGeom prst="rect">
-                      <a:avLst/>
-                    </a:prstGeom>
-                    <a:noFill/>
-                    <a:ln w="9525">
-                      <a:noFill/>
-                      <a:headEnd/>
-                      <a:tailEnd/>
-                    </a:ln>
-                  </pic:spPr>
-                </pic:pic>
-              </a:graphicData>
-            </a:graphic>
-          </wp:inline>
+          <ns3:inline>
+            <ns3:extent cx="5334000" cy="3333750"/>
+            <ns3:effectExtent b="0" l="0" r="0" t="0"/>
+            <ns3:docPr descr="Latency comparison" title="" id="38" name="Picture"/>
+            <ns4:graphic>
+              <ns4:graphicData uri="http://schemas.openxmlformats.org/drawingml/2006/picture">
+                <ns5:pic>
+                  <ns5:nvPicPr>
+                    <ns5:cNvPr descr="./visualizations/latency_distribution.png" id="39" name="Picture"/>
+                    <ns5:cNvPicPr>
+                      <ns4:picLocks noChangeArrowheads="1" noChangeAspect="1"/>
+                    </ns5:cNvPicPr>
+                  </ns5:nvPicPr>
+                  <ns5:blipFill>
+                    <ns4:blip ns6:embed="rId37"/>
+                    <ns4:stretch>
+                      <ns4:fillRect/>
+                    </ns4:stretch>
+                  </ns5:blipFill>
+                  <ns5:spPr bwMode="auto">
+                    <ns4:xfrm>
+                      <ns4:off x="0" y="0"/>
+                      <ns4:ext cx="5334000" cy="3333750"/>
+                    </ns4:xfrm>
+                    <ns4:prstGeom prst="rect">
+                      <ns4:avLst/>
+                    </ns4:prstGeom>
+                    <ns4:noFill/>
+                    <ns4:ln w="9525">
+                      <ns4:noFill/>
+                      <ns4:headEnd/>
+                      <ns4:tailEnd/>
+                    </ns4:ln>
+                  </ns5:spPr>
+                </ns5:pic>
+              </ns4:graphicData>
+            </ns4:graphic>
+          </ns3:inline>
         </w:drawing>
       </w:r>
     </w:p>
@@ -3887,13 +3887,70 @@
     <w:p>
       <w:r>
         <w:pict>
-          <v:rect style="width:0;height:1.5pt" o:hralign="center" o:hrstd="t" o:hr="t"/>
+          <ns1:rect style="width:0;height:1.5pt" ns2:hralign="center" ns2:hrstd="t" ns2:hr="t"/>
         </w:pict>
       </w:r>
     </w:p>
     <w:bookmarkEnd w:id="40"/>
     <w:bookmarkEnd w:id="41"/>
     <w:bookmarkStart w:id="42" w:name="conclusion"/>
+    <w:p>
+      <w:pPr>
+        <w:pStyle w:val="Heading2"/>
+      </w:pPr>
+      <w:r>
+        <w:t>4.5 Qualitative Analysis</w:t>
+      </w:r>
+    </w:p>
+    <w:p>
+      <w:r>
+        <w:t>Beyond the aggregate scores, the evaluation artifacts show several qualitative patterns that are important for interpreting system readiness.</w:t>
+      </w:r>
+    </w:p>
+    <w:p>
+      <w:r>
+        <w:rPr>
+          <w:b/>
+        </w:rPr>
+        <w:t>Rubric Classifier.</w:t>
+      </w:r>
+      <w:r>
+        <w:t> The confusion matrix indicates that most errors occur at the boundary between van_dung and van_dung_cao. Lower cognitive levels are stable: nhan_biet, thong_hieu, and van_dung each achieve 9/10 correct classifications. The main failure mode is conservative downgrading, where 6/10 van_dung_cao questions are classified as van_dung. In a tutoring system, this is less harmful than overestimating difficulty, but it can under-challenge stronger students and weaken the adaptive learning path.</w:t>
+      </w:r>
+    </w:p>
+    <w:p>
+      <w:r>
+        <w:rPr>
+          <w:b/>
+        </w:rPr>
+        <w:t>Problem Parser.</w:t>
+      </w:r>
+      <w:r>
+        <w:t> The parser artifact is a synthetic PDF generated at evaluation time with three math questions and one vector-drawn circle. Qualitatively, the parser recovers all three question types represented in the test case: one multiple-choice item, one short-answer algebra item, and one geometry item with an illustration. The detected image flag confirms that the parser can surface visual content, but the current metric does not verify whether the image is attached to the correct question or whether a crop box is geometrically accurate. Because the PDF contains a text layer, this benchmark primarily validates structured extraction from PDF/text plus basic illustration detection; it should not be interpreted as a full OCR benchmark on noisy scanned exams.</w:t>
+      </w:r>
+    </w:p>
+    <w:p>
+      <w:r>
+        <w:rPr>
+          <w:b/>
+        </w:rPr>
+        <w:t>QA Generator.</w:t>
+      </w:r>
+      <w:r>
+        <w:t> The generated MCQA artifacts are structurally consistent: questions contain stems, four answer options, valid answer keys, and explanations. The LLM Judge results suggest that distractors are pedagogically plausible, usually matching the unit and answer type of the correct option. The main qualitative weakness is mathematical reliability in multi-step topics. Errors are concentrated in geometry and fraction topics, where the model may apply a formula incorrectly or produce an inconsistent answer key. This suggests that a post-generation solver or verification pass is needed before generated questions are shown to students.</w:t>
+      </w:r>
+    </w:p>
+    <w:p>
+      <w:r>
+        <w:rPr>
+          <w:b/>
+        </w:rPr>
+        <w:t>Artifacts Produced.</w:t>
+      </w:r>
+      <w:r>
+        <w:t> The evaluation persists evaluation_results.json as the machine-readable summary and generates five visualization artifacts: rubric_confusion_matrix.png, rubric_f1_scores.png, qa_structural_validity.png, qa_judge_scores.png, and latency_distribution.png. Raw per-question parser outputs and generated MCQA samples are not currently saved, so qualitative review depends on console output and aggregate artifacts. Saving these raw outputs in future runs would make error analysis more reproducible.</w:t>
+      </w:r>
+    </w:p>
     <w:p>
       <w:pPr>
         <w:pStyle w:val="Heading2"/>

</xml_diff>